<commit_message>
feat: add GA4 case study section with screenshots, nav links, and resume update
- Add #case-studies scrollable section after Education with full GA4 debugging case study
- Embedded 3 screenshots (no-data, realtime-success, infographic)
- Add sidebar nav link '📄 Case Studies'
- Add hero CTA '📄 Case Study' button (red-tinted)
- Add mobile bottom nav 'Cases' button
- Update UPDATED_RESUME_CONTENT.md with Case Studies section
- Update generate_docx.py with Case Studies section
- Regenerate ADITYA_SINGH_RESUME_UPDATED.docx
</commit_message>
<xml_diff>
--- a/Resume/ADITYA_SINGH_RESUME_UPDATED.docx
+++ b/Resume/ADITYA_SINGH_RESUME_UPDATED.docx
@@ -574,6 +574,77 @@
           <w:color w:val="000000"/>
           <w:sz w:val="24"/>
         </w:rPr>
+        <w:t>CASE STUDIES</w:t>
+      </w:r>
+    </w:p>
+    <w:p>
+      <w:pPr>
+        <w:spacing w:before="120" w:after="0"/>
+      </w:pPr>
+      <w:r>
+        <w:rPr>
+          <w:rFonts w:ascii="Arial" w:hAnsi="Arial"/>
+          <w:b/>
+          <w:sz w:val="22"/>
+        </w:rPr>
+        <w:t>Diagnosing &amp; Fixing a Silent GA4 Analytics Failure  —  A.S. Enterpriis</w:t>
+      </w:r>
+      <w:r>
+        <w:rPr>
+          <w:rFonts w:ascii="Arial" w:hAnsi="Arial"/>
+          <w:i/>
+          <w:color w:val="505050"/>
+          <w:sz w:val="20"/>
+        </w:rPr>
+        <w:t xml:space="preserve">  |  March 2026</w:t>
+      </w:r>
+    </w:p>
+    <w:p>
+      <w:pPr>
+        <w:pStyle w:val="ListBullet"/>
+        <w:spacing w:before="20" w:after="20"/>
+      </w:pPr>
+      <w:r>
+        <w:rPr>
+          <w:rFonts w:ascii="Arial" w:hAnsi="Arial"/>
+          <w:sz w:val="21"/>
+        </w:rPr>
+        <w:t>Identified root cause of 7 days of zero GA4 data: an orphaned Measurement ID caused by an account-level property migration that silently disconnected Google's tag-serving backend — undetectable in the GA4 admin UI.</w:t>
+      </w:r>
+    </w:p>
+    <w:p>
+      <w:pPr>
+        <w:pStyle w:val="ListBullet"/>
+        <w:spacing w:before="20" w:after="20"/>
+      </w:pPr>
+      <w:r>
+        <w:rPr>
+          <w:rFonts w:ascii="Arial" w:hAnsi="Arial"/>
+          <w:sz w:val="21"/>
+        </w:rPr>
+        <w:t>Performed network-level HTTP debugging (diagnosed 404 → 200 status mismatch), re-created the data stream, and deployed the fix via GitHub → Vercel CI/CD pipeline in under 2 hours, fully restoring data collection.</w:t>
+      </w:r>
+    </w:p>
+    <w:p>
+      <w:pPr>
+        <w:spacing w:before="40" w:after="40"/>
+        <w:pBdr>
+          <w:bottom w:val="single" w:sz="6" w:space="1" w:color="auto"/>
+        </w:pBdr>
+      </w:pPr>
+    </w:p>
+    <w:p>
+      <w:pPr>
+        <w:pStyle w:val="Heading1"/>
+        <w:spacing w:before="200" w:after="80"/>
+      </w:pPr>
+      <w:r>
+        <w:rPr>
+          <w:rFonts w:ascii="Arial" w:hAnsi="Arial"/>
+          <w:b/>
+          <w:color w:val="000000"/>
+          <w:sz w:val="24"/>
+        </w:rPr>
         <w:t>EDUCATION</w:t>
       </w:r>
     </w:p>

</xml_diff>

<commit_message>
feat: Add Image Lightbox and Markdown Viewer for Case Studies
</commit_message>
<xml_diff>
--- a/Resume/ADITYA_SINGH_RESUME_UPDATED.docx
+++ b/Resume/ADITYA_SINGH_RESUME_UPDATED.docx
@@ -587,6 +587,67 @@
           <w:b/>
           <w:sz w:val="22"/>
         </w:rPr>
+        <w:t>Full Technical SEO Audit &amp; Implementation  —  A.S. Enterpriis</w:t>
+      </w:r>
+      <w:r>
+        <w:rPr>
+          <w:rFonts w:ascii="Arial" w:hAnsi="Arial"/>
+          <w:i/>
+          <w:color w:val="505050"/>
+          <w:sz w:val="20"/>
+        </w:rPr>
+        <w:t xml:space="preserve">  |  March 2026</w:t>
+      </w:r>
+    </w:p>
+    <w:p>
+      <w:pPr>
+        <w:pStyle w:val="ListBullet"/>
+        <w:spacing w:before="20" w:after="20"/>
+      </w:pPr>
+      <w:r>
+        <w:rPr>
+          <w:rFonts w:ascii="Arial" w:hAnsi="Arial"/>
+          <w:sz w:val="21"/>
+        </w:rPr>
+        <w:t>Conducted a comprehensive 16-point Next.js App Router SEO audit, achieving a 100% compliance score and resolving critical indexation blockers.</w:t>
+      </w:r>
+    </w:p>
+    <w:p>
+      <w:pPr>
+        <w:pStyle w:val="ListBullet"/>
+        <w:spacing w:before="20" w:after="20"/>
+      </w:pPr>
+      <w:r>
+        <w:rPr>
+          <w:rFonts w:ascii="Arial" w:hAnsi="Arial"/>
+          <w:sz w:val="21"/>
+        </w:rPr>
+        <w:t>Implemented dynamic sitemaps, semantic JSON-LD structured data (Product, ItemList, BreadcrumbList), and programmatic canonicals.</w:t>
+      </w:r>
+    </w:p>
+    <w:p>
+      <w:pPr>
+        <w:pStyle w:val="ListBullet"/>
+        <w:spacing w:before="20" w:after="20"/>
+      </w:pPr>
+      <w:r>
+        <w:rPr>
+          <w:rFonts w:ascii="Arial" w:hAnsi="Arial"/>
+          <w:sz w:val="21"/>
+        </w:rPr>
+        <w:t>Resulted in a 1,600% increase in indexed URLs in Google Search Console, transforming a single-page presence into 17 high-intent B2B organic entry points.</w:t>
+      </w:r>
+    </w:p>
+    <w:p>
+      <w:pPr>
+        <w:spacing w:before="120" w:after="0"/>
+      </w:pPr>
+      <w:r>
+        <w:rPr>
+          <w:rFonts w:ascii="Arial" w:hAnsi="Arial"/>
+          <w:b/>
+          <w:sz w:val="22"/>
+        </w:rPr>
         <w:t>Diagnosing &amp; Fixing a Silent GA4 Analytics Failure  —  A.S. Enterpriis</w:t>
       </w:r>
       <w:r>

</xml_diff>